<commit_message>
Update skill guides and packages with GitHub installation commands
</commit_message>
<xml_diff>
--- a/white-skill/docs/domain-modeling-guide.docx
+++ b/white-skill/docs/domain-modeling-guide.docx
@@ -122,7 +122,7 @@
         <w:widowControl/>
       </w:pPr>
       <w:r>
-        <w:t>解压并安装</w:t>
+        <w:t>从 GitHub 安装</w:t>
       </w:r>
     </w:p>
     <w:p>
@@ -130,12 +130,48 @@
         <w:widowControl/>
       </w:pPr>
       <w:r>
-        <w:t>解压 Domain Modeling 分享包，找到 domain-modeling 文件夹。将这个完整文件夹复制到个人技能目录；已有同名技能时，先备份再决定是否替换。</w:t>
+        <w:t>先安装 Node.js（包含 npm 和 npx）。在 Mac 终端或 Windows PowerShell 输入下面同一条命令，按提示完成安装。</w:t>
       </w:r>
     </w:p>
     <w:p>
       <w:pPr>
         <w:pStyle w:val="Code"/>
+        <w:keepNext w:val="0"/>
+        <w:widowControl/>
+      </w:pPr>
+      <w:r>
+        <w:t>npx skills add https://github.com/whitebai968/white-kit/tree/main/white-skill --skill domain-modeling -g -a codex</w:t>
+      </w:r>
+    </w:p>
+    <w:p>
+      <w:pPr>
+        <w:widowControl/>
+      </w:pPr>
+      <w:r>
+        <w:t>该命令从 white-kit 的 white-skill 目录读取对应技能，安装到 Codex 的个人技能目录。已有同名技能时先备份，再决定是否替换。</w:t>
+      </w:r>
+    </w:p>
+    <w:p>
+      <w:pPr>
+        <w:pStyle w:val="Heading2"/>
+        <w:widowControl/>
+      </w:pPr>
+      <w:r>
+        <w:t>下载分享包安装</w:t>
+      </w:r>
+    </w:p>
+    <w:p>
+      <w:pPr>
+        <w:widowControl/>
+      </w:pPr>
+      <w:r>
+        <w:t>也可下载 white-skill/packages/domain-modeling.zip。解压后，把里面完整的 domain-modeling 文件夹复制到下列目录；目录不存在时先创建。</w:t>
+      </w:r>
+    </w:p>
+    <w:p>
+      <w:pPr>
+        <w:pStyle w:val="Code"/>
+        <w:keepNext w:val="0"/>
         <w:widowControl/>
       </w:pPr>
       <w:r>
@@ -145,10 +181,11 @@
     <w:p>
       <w:pPr>
         <w:pStyle w:val="Code"/>
+        <w:keepNext w:val="0"/>
         <w:widowControl/>
       </w:pPr>
       <w:r>
-        <w:t>Windows  %USERPROFILE%\.agents\skills\</w:t>
+        <w:t>Windows  %USERPROFILE%\.agents\skills</w:t>
       </w:r>
     </w:p>
     <w:p>
@@ -156,43 +193,7 @@
         <w:widowControl/>
       </w:pPr>
       <w:r>
-        <w:t>目录不存在时，在终端或 PowerShell 运行对应命令，再复制技能文件夹。</w:t>
-      </w:r>
-    </w:p>
-    <w:p>
-      <w:pPr>
-        <w:pStyle w:val="Small"/>
-        <w:widowControl/>
-      </w:pPr>
-      <w:r>
-        <w:t>Mac 或 Linux</w:t>
-      </w:r>
-    </w:p>
-    <w:p>
-      <w:pPr>
-        <w:pStyle w:val="Code"/>
-        <w:widowControl/>
-      </w:pPr>
-      <w:r>
-        <w:t>mkdir -p "$HOME/.agents/skills"</w:t>
-      </w:r>
-    </w:p>
-    <w:p>
-      <w:pPr>
-        <w:pStyle w:val="Small"/>
-        <w:widowControl/>
-      </w:pPr>
-      <w:r>
-        <w:t>Windows PowerShell</w:t>
-      </w:r>
-    </w:p>
-    <w:p>
-      <w:pPr>
-        <w:pStyle w:val="Code"/>
-        <w:widowControl/>
-      </w:pPr>
-      <w:r>
-        <w:t>New-Item -ItemType Directory -Force "$env:USERPROFILE\.agents\skills" | Out-Null</w:t>
+        <w:t>技能名文件夹内应直接有 SKILL.md，参考文件也要保留。分享包内的安装说明提供首次创建目录的命令。</w:t>
       </w:r>
     </w:p>
     <w:p>
@@ -201,7 +202,7 @@
         <w:widowControl/>
       </w:pPr>
       <w:r>
-        <w:t>检查安装</w:t>
+        <w:t>检查并开始使用</w:t>
       </w:r>
     </w:p>
     <w:p>
@@ -209,38 +210,13 @@
         <w:widowControl/>
       </w:pPr>
       <w:r>
-        <w:t>最终路径应包含技能名文件夹，且其中直接有 SKILL.md。不要把分享包外层目录一起作为技能目录。</w:t>
+        <w:t>打开新的 Codex 会话调用技能；未识别时重启 Codex。CLI 或 IDE 扩展可用 /skills 查找。复制下面指令并替换括号中的内容。</w:t>
       </w:r>
     </w:p>
     <w:p>
       <w:pPr>
         <w:pStyle w:val="Code"/>
-        <w:widowControl/>
-      </w:pPr>
-      <w:r>
-        <w:t>~/.agents/skills/domain-modeling/SKILL.md</w:t>
-      </w:r>
-    </w:p>
-    <w:p>
-      <w:pPr>
-        <w:widowControl/>
-      </w:pPr>
-      <w:r>
-        <w:t>打开新的 Codex 会话调用技能；若未识别，重启 Codex。CLI 或 IDE 扩展可用 /skills 查找。</w:t>
-      </w:r>
-    </w:p>
-    <w:p>
-      <w:pPr>
-        <w:pStyle w:val="Heading2"/>
-        <w:widowControl/>
-      </w:pPr>
-      <w:r>
-        <w:t>复制指令开始使用</w:t>
-      </w:r>
-    </w:p>
-    <w:p>
-      <w:pPr>
-        <w:pStyle w:val="Code"/>
+        <w:keepNext w:val="0"/>
         <w:widowControl/>
       </w:pPr>
       <w:r>
@@ -250,6 +226,7 @@
     <w:p>
       <w:pPr>
         <w:pStyle w:val="Code"/>
+        <w:keepNext w:val="0"/>
         <w:widowControl/>
       </w:pPr>
       <w:r>
@@ -280,7 +257,7 @@
         <w:widowControl/>
       </w:pPr>
       <w:r>
-        <w:t>应得到经你确认的项目术语表，写清概念含义与边界。本包使用 CONTEXT.md 保存术语；后续协作时提供该文件，有分歧再更新。关键取舍的理由单独记录。</w:t>
+        <w:t>应得到经你确认的项目术语表，写清概念含义与边界。本分享版本使用 CONTEXT.md 保存术语；后续协作时提供该文件，有分歧再更新。关键取舍理由另行记录。</w:t>
       </w:r>
     </w:p>
     <w:p>
@@ -289,7 +266,7 @@
         <w:widowControl/>
       </w:pPr>
       <w:r>
-        <w:t>本包为分享者当前使用的版本，术语表使用 CONTEXT.md；上游较新版本改用 GLOSSARY.md。</w:t>
+        <w:t>本仓库保留本次分享版本，术语表采用 CONTEXT.md；上游较新版本改用 GLOSSARY.md。</w:t>
       </w:r>
     </w:p>
     <w:p>
@@ -298,7 +275,7 @@
         <w:widowControl/>
       </w:pPr>
       <w:r>
-        <w:t>原始技能  Matt Pocock  github.com/mattpocock/skills</w:t>
+        <w:t>仓库入口  github.com/whitebai968/white-kit/tree/main/white-skill</w:t>
       </w:r>
     </w:p>
     <w:p>
@@ -307,7 +284,7 @@
         <w:widowControl/>
       </w:pPr>
       <w:r>
-        <w:t>安装与调用  learn.chatgpt.com/docs/build-skills</w:t>
+        <w:t>Node.js 下载  nodejs.org/en/download</w:t>
       </w:r>
     </w:p>
     <w:sectPr>

</xml_diff>

<commit_message>
Share installation guidance across agents and add pure skill archives
</commit_message>
<xml_diff>
--- a/white-skill/docs/domain-modeling-guide.docx
+++ b/white-skill/docs/domain-modeling-guide.docx
@@ -27,7 +27,7 @@
         <w:widowControl/>
       </w:pPr>
       <w:r>
-        <w:t>适合讨论需求、梳理业务流程、交接项目，或需要与 AI 澄清概念的人。 本指南附介绍稿、安装步骤和可复制的使用指令。</w:t>
+        <w:t>适合讨论需求、梳理业务流程、交接项目，或需要与 AI 澄清概念的人。 安装方式见各技能共用的安装指南。</w:t>
       </w:r>
     </w:p>
     <w:p>
@@ -99,7 +99,7 @@
         <w:widowControl/>
       </w:pPr>
       <w:r>
-        <w:t>介绍稿约两分钟，讲解使用示例后仍留有三分钟内的停顿余量。</w:t>
+        <w:t>介绍稿按常见语速约两分钟，安装与使用步骤作为分享后的操作说明。</w:t>
       </w:r>
     </w:p>
     <w:p>
@@ -122,7 +122,7 @@
         <w:widowControl/>
       </w:pPr>
       <w:r>
-        <w:t>从 GitHub 安装</w:t>
+        <w:t>使用共用安装指南</w:t>
       </w:r>
     </w:p>
     <w:p>
@@ -130,7 +130,7 @@
         <w:widowControl/>
       </w:pPr>
       <w:r>
-        <w:t>先安装 Node.js（包含 npm 和 npx）。在 Mac 终端或 Windows PowerShell 输入下面同一条命令，按提示完成安装。</w:t>
+        <w:t>WorkBuddy、Codex、Claude Code 和 Hermes 共用同一份指南，按所用工具选择原生导入、安装命令或目录复制。默认目录和刷新要求集中维护在这里。</w:t>
       </w:r>
     </w:p>
     <w:p>
@@ -138,17 +138,10 @@
         <w:pStyle w:val="Code"/>
         <w:keepNext w:val="0"/>
         <w:widowControl/>
+        <w:spacing w:line="324" w:lineRule="auto" w:after="140"/>
       </w:pPr>
       <w:r>
-        <w:t>npx skills add https://github.com/whitebai968/white-kit/tree/main/white-skill --skill domain-modeling -g -a codex</w:t>
-      </w:r>
-    </w:p>
-    <w:p>
-      <w:pPr>
-        <w:widowControl/>
-      </w:pPr>
-      <w:r>
-        <w:t>该命令从 white-kit 的 white-skill 目录读取对应技能，安装到 Codex 的个人技能目录。已有同名技能时先备份，再决定是否替换。</w:t>
+        <w:t>https://github.com/whitebai968/white-kit/blob/main/white-skill/INSTALL.md</w:t>
       </w:r>
     </w:p>
     <w:p>
@@ -157,7 +150,7 @@
         <w:widowControl/>
       </w:pPr>
       <w:r>
-        <w:t>下载分享包安装</w:t>
+        <w:t>让 Agent 帮你安装</w:t>
       </w:r>
     </w:p>
     <w:p>
@@ -165,7 +158,7 @@
         <w:widowControl/>
       </w:pPr>
       <w:r>
-        <w:t>也可下载 white-skill/packages/domain-modeling.zip。解压后，把里面完整的 domain-modeling 文件夹复制到下列目录；目录不存在时先创建。</w:t>
+        <w:t>在能联网、能操作本机文件并支持 Skills 的 Agent 中发送下面这段。它需要遵循工具自己的导入入口和权限确认；安装完成后检查技能是否可见。</w:t>
       </w:r>
     </w:p>
     <w:p>
@@ -173,27 +166,10 @@
         <w:pStyle w:val="Code"/>
         <w:keepNext w:val="0"/>
         <w:widowControl/>
+        <w:spacing w:line="324" w:lineRule="auto" w:after="140"/>
       </w:pPr>
       <w:r>
-        <w:t>Mac 或 Linux  ~/.agents/skills/</w:t>
-      </w:r>
-    </w:p>
-    <w:p>
-      <w:pPr>
-        <w:pStyle w:val="Code"/>
-        <w:keepNext w:val="0"/>
-        <w:widowControl/>
-      </w:pPr>
-      <w:r>
-        <w:t>Windows  %USERPROFILE%\.agents\skills</w:t>
-      </w:r>
-    </w:p>
-    <w:p>
-      <w:pPr>
-        <w:widowControl/>
-      </w:pPr>
-      <w:r>
-        <w:t>技能名文件夹内应直接有 SKILL.md，参考文件也要保留。分享包内的安装说明提供首次创建目录的命令。</w:t>
+        <w:t>请阅读 https://raw.githubusercontent.com/whitebai968/white-kit/main/white-skill/INSTALL_PROMPT.md ，将 domain-modeling 安装到我当前 Agent 的个人技能目录，按指南检查并告诉我怎样调用。</w:t>
       </w:r>
     </w:p>
     <w:p>
@@ -202,7 +178,7 @@
         <w:widowControl/>
       </w:pPr>
       <w:r>
-        <w:t>检查并开始使用</w:t>
+        <w:t>下载包的区别</w:t>
       </w:r>
     </w:p>
     <w:p>
@@ -210,7 +186,7 @@
         <w:widowControl/>
       </w:pPr>
       <w:r>
-        <w:t>打开新的 Codex 会话调用技能；未识别时重启 Codex。CLI 或 IDE 扩展可用 /skills 查找。复制下面指令并替换括号中的内容。</w:t>
+        <w:t>domain-modeling-skill.zip 是纯技能安装包，内部只有一个技能目录；适合原生 ZIP 导入或手动复制。domain-modeling.zip 是完整分享包，包含本指南和共用安装说明。</w:t>
       </w:r>
     </w:p>
     <w:p>
@@ -218,29 +194,10 @@
         <w:pStyle w:val="Code"/>
         <w:keepNext w:val="0"/>
         <w:widowControl/>
+        <w:spacing w:line="324" w:lineRule="auto" w:after="140"/>
       </w:pPr>
       <w:r>
-        <w:t>$domain-modeling</w:t>
-      </w:r>
-    </w:p>
-    <w:p>
-      <w:pPr>
-        <w:pStyle w:val="Code"/>
-        <w:keepNext w:val="0"/>
-        <w:widowControl/>
-      </w:pPr>
-      <w:r>
-        <w:t>我在做【项目】，现有流程和文档：【粘贴内容】。</w:t>
-      </w:r>
-    </w:p>
-    <w:p>
-      <w:pPr>
-        <w:pStyle w:val="Code"/>
-        <w:keepNext w:val="0"/>
-        <w:widowControl/>
-      </w:pPr>
-      <w:r>
-        <w:t>请找出容易混淆的概念，和我澄清含义、关系及边界，用具体场景检查定义，并把确认结果更新到项目术语表；值得长期保留的重要取舍另行记录理由。</w:t>
+        <w:t>https://raw.githubusercontent.com/whitebai968/white-kit/main/white-skill/packages/domain-modeling-skill.zip</w:t>
       </w:r>
     </w:p>
     <w:p>
@@ -249,7 +206,7 @@
         <w:widowControl/>
       </w:pPr>
       <w:r>
-        <w:t>检查产出</w:t>
+        <w:t>开始使用</w:t>
       </w:r>
     </w:p>
     <w:p>
@@ -257,7 +214,46 @@
         <w:widowControl/>
       </w:pPr>
       <w:r>
-        <w:t>应得到经你确认的项目术语表，写清概念含义与边界。本分享版本使用 CONTEXT.md 保存术语；后续协作时提供该文件，有分歧再更新。关键取舍理由另行记录。</w:t>
+        <w:t>安装后在工具的技能列表或选择器里确认。可直接在请求中指定技能名；特殊调用符号按当前工具使用。</w:t>
+      </w:r>
+    </w:p>
+    <w:p>
+      <w:pPr>
+        <w:pStyle w:val="Code"/>
+        <w:keepNext w:val="0"/>
+        <w:widowControl/>
+        <w:spacing w:line="324" w:lineRule="auto" w:after="140"/>
+      </w:pPr>
+      <w:r>
+        <w:t>请使用 domain-modeling 梳理这个项目的业务概念，和我澄清含义、关系及边界，用具体场景检查定义，将确认的结果更新到项目术语表。</w:t>
+      </w:r>
+    </w:p>
+    <w:p>
+      <w:pPr>
+        <w:pStyle w:val="Code"/>
+        <w:keepNext w:val="0"/>
+        <w:widowControl/>
+        <w:spacing w:line="324" w:lineRule="auto" w:after="140"/>
+      </w:pPr>
+      <w:r>
+        <w:t>项目与现有资料：【粘贴内容或提供文件】</w:t>
+      </w:r>
+    </w:p>
+    <w:p>
+      <w:pPr>
+        <w:pStyle w:val="Heading2"/>
+        <w:widowControl/>
+      </w:pPr>
+      <w:r>
+        <w:t>检查结果</w:t>
+      </w:r>
+    </w:p>
+    <w:p>
+      <w:pPr>
+        <w:widowControl/>
+      </w:pPr>
+      <w:r>
+        <w:t>应得到经你确认的项目术语表，写清概念含义与边界。本分享版使用 CONTEXT.md；后续协作时提供该文件，有分歧再更新。值得记录的关键取舍单独保存理由。</w:t>
       </w:r>
     </w:p>
     <w:p>
@@ -266,25 +262,7 @@
         <w:widowControl/>
       </w:pPr>
       <w:r>
-        <w:t>本仓库保留本次分享版本，术语表采用 CONTEXT.md；上游较新版本改用 GLOSSARY.md。</w:t>
-      </w:r>
-    </w:p>
-    <w:p>
-      <w:pPr>
-        <w:pStyle w:val="Small"/>
-        <w:widowControl/>
-      </w:pPr>
-      <w:r>
-        <w:t>仓库入口  github.com/whitebai968/white-kit/tree/main/white-skill</w:t>
-      </w:r>
-    </w:p>
-    <w:p>
-      <w:pPr>
-        <w:pStyle w:val="Small"/>
-        <w:widowControl/>
-      </w:pPr>
-      <w:r>
-        <w:t>Node.js 下载  nodejs.org/en/download</w:t>
+        <w:t>技能源自 Matt Pocock；本仓库保留此次分享版本。安装说明以仓库的共用指南为准。</w:t>
       </w:r>
     </w:p>
     <w:sectPr>

</xml_diff>